<commit_message>
Complete author details across submission documents
Student name, identifier and cohort filled on both official cover sheets
and on the title pages of the case study and the AI declaration. Signature
and date fields are left blank on the cover sheets, since those are signed
by hand against a declaration of original work.
</commit_message>
<xml_diff>
--- a/AI_DECLARATION.docx
+++ b/AI_DECLARATION.docx
@@ -36,7 +36,16 @@
         <w:t>Student ID:</w:t>
       </w:r>
       <w:r>
-        <w:t xml:space="preserve"> [ REQUIRED — fill in ] </w:t>
+        <w:t xml:space="preserve"> 100012452 </w:t>
+      </w:r>
+      <w:r>
+        <w:rPr>
+          <w:b/>
+        </w:rPr>
+        <w:t>Cohort:</w:t>
+      </w:r>
+      <w:r>
+        <w:t xml:space="preserve"> Block 3, 2026 </w:t>
       </w:r>
       <w:r>
         <w:rPr>

</xml_diff>

<commit_message>
Remove the last placeholders and correct two false claims
The video is 7 MB, under Moodle's 40 MB limit, so it is submitted with the
portfolio rather than hosted. The two "paste OneDrive share link" placeholders
are gone along with the need for them.

The AI declaration carried two statements that were not true. It said the case
study has seventeen references when it has eighteen, and that the unchecked
ones are marked in that document as requiring verification, which they are not.
Both are corrected, because a declaration that misdescribes the work is worse
than the disclosure it was meant to make.

It also named one author while Part 2 is a joint submission, so Roshan Aryal is
named with the split and with a note that he declares his own part.

Deliverable counts in the checklist were stale in four places and now match what
the files actually contain.
</commit_message>
<xml_diff>
--- a/AI_DECLARATION.docx
+++ b/AI_DECLARATION.docx
@@ -54,7 +54,21 @@
         <w:t>Applies to:</w:t>
       </w:r>
       <w:r>
-        <w:t xml:space="preserve"> Part 1 Case Study Analysis and Part 2 Project Portfolio</w:t>
+        <w:t xml:space="preserve"> Part 1 Case Study Analysis (individual) and Part 2 Project Portfolio (group)</w:t>
+      </w:r>
+    </w:p>
+    <w:p>
+      <w:r>
+        <w:t xml:space="preserve">Part 2 was produced jointly with </w:t>
+      </w:r>
+      <w:r>
+        <w:rPr>
+          <w:b/>
+        </w:rPr>
+        <w:t>Roshan Aryal (1000123440)</w:t>
+      </w:r>
+      <w:r>
+        <w:t>, an equal 50/50 split. This declaration covers the work as submitted; Roshan submits his own declaration for his part.</w:t>
       </w:r>
     </w:p>
     <w:p>
@@ -219,7 +233,7 @@
     </w:p>
     <w:p>
       <w:r>
-        <w:t>Four of the seventeen references in the case study were verified against published records. The remainder are standard works in the field and are marked in that document as requiring verification.</w:t>
+        <w:t>The case study carries eighteen references. Four were checked directly against published records; the remainder are standard works in the field cited from prior familiarity rather than re-checked page by page.</w:t>
       </w:r>
     </w:p>
     <w:p>

</xml_diff>

<commit_message>
Add narration to the demonstration video and declare it
The narration runs 130 s against a 109 s cut. The extra 21 s is absorbed by the
static cards rather than by stretching footage, because stretching would drift
the burned-in captions away from what is on screen. A pause in the narration
falls within a second of the recap-card boundary, which suggests the blocks are
tracking, but the synchronisation has not been checked by ear.

The voice is synthesised, not either author's. That is now stated in the
generative AI declaration alongside the subtitles and the agent-driven screen
captures, and the portfolio's video section points a reader to it. A synthetic
voice presented as a student's own on an assessed submission is the kind of
thing that has to be disclosed rather than assumed harmless.
</commit_message>
<xml_diff>
--- a/AI_DECLARATION.docx
+++ b/AI_DECLARATION.docx
@@ -153,6 +153,26 @@
       </w:r>
       <w:r>
         <w:t xml:space="preserve"> The firmware was submitted to an independent AI review (OpenAI Codex) on two occasions. The first identified twelve issues, including a cross-task data race and several inaccurate claims in the portfolio. The second reviewed the resulting changes and rejected the proposed security mitigation as inadequate, which led directly to implementing ESP-NOW link encryption.</w:t>
+      </w:r>
+    </w:p>
+    <w:p>
+      <w:r>
+        <w:rPr>
+          <w:b/>
+        </w:rPr>
+        <w:t>Demonstration video.</w:t>
+      </w:r>
+      <w:r>
+        <w:t xml:space="preserve"> The video was assembled with AI assistance from footage filmed by the authors. The on-screen subtitles were written by AI, and </w:t>
+      </w:r>
+      <w:r>
+        <w:rPr>
+          <w:b/>
+        </w:rPr>
+        <w:t>the spoken narration is a synthesised voice generated with ElevenLabs — it is not either author's voice.</w:t>
+      </w:r>
+      <w:r>
+        <w:t xml:space="preserve"> The screen recordings of the ThingsBoard dashboard were captured by an AI agent driving the browser; the telemetry shown in them is genuine output from the authors' own hardware.</w:t>
       </w:r>
     </w:p>
     <w:p>

</xml_diff>

<commit_message>
Correct the narration attribution
The declaration stated the voiceover was synthesised. It is a human recording;
the filename that suggested otherwise was a joke. Corrected in the declaration
and in the portfolio's video section.

The error was mine and it was the wrong way round for an integrity document -
it credited a machine for work a person did.
</commit_message>
<xml_diff>
--- a/AI_DECLARATION.docx
+++ b/AI_DECLARATION.docx
@@ -163,16 +163,13 @@
         <w:t>Demonstration video.</w:t>
       </w:r>
       <w:r>
-        <w:t xml:space="preserve"> The video was assembled with AI assistance from footage filmed by the authors. The on-screen subtitles were written by AI, and </w:t>
+        <w:t xml:space="preserve"> The video was assembled with AI assistance from footage filmed by the authors, and the on-screen subtitles were written by AI. The screen recordings of the ThingsBoard dashboard were captured by an AI agent driving the browser; the telemetry shown in them is genuine output from the authors' own hardware. </w:t>
       </w:r>
       <w:r>
         <w:rPr>
           <w:b/>
         </w:rPr>
-        <w:t>the spoken narration is a synthesised voice generated with ElevenLabs — it is not either author's voice.</w:t>
-      </w:r>
-      <w:r>
-        <w:t xml:space="preserve"> The screen recordings of the ThingsBoard dashboard were captured by an AI agent driving the browser; the telemetry shown in them is genuine output from the authors' own hardware.</w:t>
+        <w:t>The spoken narration is a human recording, not synthesised.</w:t>
       </w:r>
     </w:p>
     <w:p>

</xml_diff>